<commit_message>
lecture 5 and 6 notes added
</commit_message>
<xml_diff>
--- a/01 - Lecture 01 - 07-09-2026.docx
+++ b/01 - Lecture 01 - 07-09-2026.docx
@@ -63,6 +63,14 @@
     </w:p>
     <w:sdt>
       <w:sdtPr>
+        <w:rPr>
+          <w:rFonts w:asciiTheme="minorHAnsi" w:eastAsiaTheme="minorHAnsi" w:hAnsiTheme="minorHAnsi" w:cstheme="minorBidi"/>
+          <w:color w:val="auto"/>
+          <w:kern w:val="2"/>
+          <w:sz w:val="24"/>
+          <w:szCs w:val="24"/>
+          <w14:ligatures w14:val="standardContextual"/>
+        </w:rPr>
         <w:id w:val="1292323910"/>
         <w:docPartObj>
           <w:docPartGallery w:val="Table of Contents"/>
@@ -71,15 +79,7 @@
       </w:sdtPr>
       <w:sdtEndPr>
         <w:rPr>
-          <w:rFonts w:asciiTheme="minorHAnsi" w:eastAsiaTheme="minorHAnsi" w:hAnsiTheme="minorHAnsi" w:cstheme="minorBidi"/>
-          <w:b/>
-          <w:bCs/>
           <w:noProof/>
-          <w:color w:val="auto"/>
-          <w:kern w:val="2"/>
-          <w:sz w:val="24"/>
-          <w:szCs w:val="24"/>
-          <w14:ligatures w14:val="standardContextual"/>
         </w:rPr>
       </w:sdtEndPr>
       <w:sdtContent>
@@ -95,10 +95,10 @@
           <w:pPr>
             <w:pStyle w:val="TOC1"/>
             <w:tabs>
-              <w:tab w:val="left" w:pos="480"/>
               <w:tab w:val="right" w:leader="dot" w:pos="9350"/>
             </w:tabs>
             <w:rPr>
+              <w:rFonts w:eastAsiaTheme="minorEastAsia"/>
               <w:noProof/>
             </w:rPr>
           </w:pPr>
@@ -111,42 +111,23 @@
           <w:r>
             <w:fldChar w:fldCharType="separate"/>
           </w:r>
-          <w:hyperlink w:anchor="_Toc240568468" w:history="1">
+          <w:hyperlink w:anchor="_Toc241089963" w:history="1">
             <w:r>
               <w:rPr>
                 <w:rStyle w:val="Hyperlink"/>
-                <w:rFonts w:ascii="Times New Roman" w:hAnsi="Times New Roman" w:cs="Times New Roman"/>
-                <w:b/>
-                <w:bCs/>
-                <w:noProof/>
-              </w:rPr>
-              <w:t>1.</w:t>
-            </w:r>
-            <w:r>
-              <w:rPr>
-                <w:noProof/>
+                <w:noProof/>
+              </w:rPr>
+              <w:t>Introduction to Data Science:</w:t>
+            </w:r>
+            <w:r>
+              <w:rPr>
+                <w:noProof/>
+                <w:webHidden/>
               </w:rPr>
               <w:tab/>
             </w:r>
             <w:r>
               <w:rPr>
-                <w:rStyle w:val="Hyperlink"/>
-                <w:rFonts w:ascii="Times New Roman" w:hAnsi="Times New Roman" w:cs="Times New Roman"/>
-                <w:b/>
-                <w:bCs/>
-                <w:noProof/>
-              </w:rPr>
-              <w:t>Introduction to Data Science:</w:t>
-            </w:r>
-            <w:r>
-              <w:rPr>
-                <w:noProof/>
-                <w:webHidden/>
-              </w:rPr>
-              <w:tab/>
-            </w:r>
-            <w:r>
-              <w:rPr>
                 <w:noProof/>
                 <w:webHidden/>
               </w:rPr>
@@ -157,7 +138,7 @@
                 <w:noProof/>
                 <w:webHidden/>
               </w:rPr>
-              <w:instrText xml:space="preserve"> PAGEREF _Toc240568468 \h </w:instrText>
+              <w:instrText xml:space="preserve"> PAGEREF _Toc241089963 \h </w:instrText>
             </w:r>
             <w:r>
               <w:rPr>
@@ -195,10 +176,11 @@
               <w:tab w:val="right" w:leader="dot" w:pos="9350"/>
             </w:tabs>
             <w:rPr>
+              <w:rFonts w:eastAsiaTheme="minorEastAsia"/>
               <w:noProof/>
             </w:rPr>
           </w:pPr>
-          <w:hyperlink w:anchor="_Toc240568469" w:history="1">
+          <w:hyperlink w:anchor="_Toc241089964" w:history="1">
             <w:r>
               <w:rPr>
                 <w:rStyle w:val="Hyperlink"/>
@@ -227,7 +209,7 @@
                 <w:noProof/>
                 <w:webHidden/>
               </w:rPr>
-              <w:instrText xml:space="preserve"> PAGEREF _Toc240568469 \h </w:instrText>
+              <w:instrText xml:space="preserve"> PAGEREF _Toc241089964 \h </w:instrText>
             </w:r>
             <w:r>
               <w:rPr>
@@ -265,10 +247,11 @@
               <w:tab w:val="right" w:leader="dot" w:pos="9350"/>
             </w:tabs>
             <w:rPr>
+              <w:rFonts w:eastAsiaTheme="minorEastAsia"/>
               <w:noProof/>
             </w:rPr>
           </w:pPr>
-          <w:hyperlink w:anchor="_Toc240568470" w:history="1">
+          <w:hyperlink w:anchor="_Toc241089965" w:history="1">
             <w:r>
               <w:rPr>
                 <w:rStyle w:val="Hyperlink"/>
@@ -297,7 +280,7 @@
                 <w:noProof/>
                 <w:webHidden/>
               </w:rPr>
-              <w:instrText xml:space="preserve"> PAGEREF _Toc240568470 \h </w:instrText>
+              <w:instrText xml:space="preserve"> PAGEREF _Toc241089965 \h </w:instrText>
             </w:r>
             <w:r>
               <w:rPr>
@@ -332,49 +315,30 @@
           <w:pPr>
             <w:pStyle w:val="TOC1"/>
             <w:tabs>
-              <w:tab w:val="left" w:pos="480"/>
               <w:tab w:val="right" w:leader="dot" w:pos="9350"/>
             </w:tabs>
             <w:rPr>
+              <w:rFonts w:eastAsiaTheme="minorEastAsia"/>
               <w:noProof/>
             </w:rPr>
           </w:pPr>
-          <w:hyperlink w:anchor="_Toc240568471" w:history="1">
+          <w:hyperlink w:anchor="_Toc241089966" w:history="1">
             <w:r>
               <w:rPr>
                 <w:rStyle w:val="Hyperlink"/>
-                <w:rFonts w:ascii="Times New Roman" w:hAnsi="Times New Roman" w:cs="Times New Roman"/>
-                <w:b/>
-                <w:bCs/>
-                <w:noProof/>
-              </w:rPr>
-              <w:t>2.</w:t>
-            </w:r>
-            <w:r>
-              <w:rPr>
-                <w:noProof/>
+                <w:noProof/>
+              </w:rPr>
+              <w:t>Data Science Workflow:</w:t>
+            </w:r>
+            <w:r>
+              <w:rPr>
+                <w:noProof/>
+                <w:webHidden/>
               </w:rPr>
               <w:tab/>
             </w:r>
             <w:r>
               <w:rPr>
-                <w:rStyle w:val="Hyperlink"/>
-                <w:rFonts w:ascii="Times New Roman" w:hAnsi="Times New Roman" w:cs="Times New Roman"/>
-                <w:b/>
-                <w:bCs/>
-                <w:noProof/>
-              </w:rPr>
-              <w:t>Data Science Workflow:</w:t>
-            </w:r>
-            <w:r>
-              <w:rPr>
-                <w:noProof/>
-                <w:webHidden/>
-              </w:rPr>
-              <w:tab/>
-            </w:r>
-            <w:r>
-              <w:rPr>
                 <w:noProof/>
                 <w:webHidden/>
               </w:rPr>
@@ -385,7 +349,7 @@
                 <w:noProof/>
                 <w:webHidden/>
               </w:rPr>
-              <w:instrText xml:space="preserve"> PAGEREF _Toc240568471 \h </w:instrText>
+              <w:instrText xml:space="preserve"> PAGEREF _Toc241089966 \h </w:instrText>
             </w:r>
             <w:r>
               <w:rPr>
@@ -446,52 +410,27 @@
     <w:p>
       <w:pPr>
         <w:pStyle w:val="Heading1"/>
-        <w:numPr>
-          <w:ilvl w:val="0"/>
-          <w:numId w:val="2"/>
-        </w:numPr>
-        <w:rPr>
-          <w:rFonts w:ascii="Times New Roman" w:hAnsi="Times New Roman" w:cs="Times New Roman"/>
-          <w:b/>
-          <w:bCs/>
-          <w:sz w:val="56"/>
-          <w:szCs w:val="56"/>
-        </w:rPr>
-      </w:pPr>
-      <w:bookmarkStart w:id="0" w:name="_Toc240568468"/>
-      <w:r>
-        <w:rPr>
-          <w:rFonts w:ascii="Times New Roman" w:hAnsi="Times New Roman" w:cs="Times New Roman"/>
-          <w:b/>
-          <w:bCs/>
-          <w:sz w:val="56"/>
-          <w:szCs w:val="56"/>
-        </w:rPr>
+        <w:ind w:left="0"/>
+        <w:jc w:val="both"/>
+      </w:pPr>
+      <w:bookmarkStart w:id="0" w:name="_Toc241089963"/>
+      <w:r>
         <w:lastRenderedPageBreak/>
-        <w:t>Introduction to Data Science</w:t>
-      </w:r>
-      <w:r>
-        <w:rPr>
-          <w:rFonts w:ascii="Times New Roman" w:hAnsi="Times New Roman" w:cs="Times New Roman"/>
-          <w:b/>
-          <w:bCs/>
-          <w:sz w:val="56"/>
-          <w:szCs w:val="56"/>
-        </w:rPr>
-        <w:t>:</w:t>
+        <w:t>Introduction to Data Science:</w:t>
       </w:r>
       <w:bookmarkEnd w:id="0"/>
     </w:p>
     <w:p>
       <w:pPr>
         <w:pStyle w:val="Heading2"/>
+        <w:jc w:val="both"/>
         <w:rPr>
           <w:b/>
           <w:bCs/>
           <w:color w:val="000000" w:themeColor="text1"/>
         </w:rPr>
       </w:pPr>
-      <w:bookmarkStart w:id="1" w:name="_Toc240568469"/>
+      <w:bookmarkStart w:id="1" w:name="_Toc241089964"/>
       <w:r>
         <w:rPr>
           <w:b/>
@@ -511,6 +450,9 @@
       </w:r>
     </w:p>
     <w:p>
+      <w:pPr>
+        <w:jc w:val="both"/>
+      </w:pPr>
       <w:r>
         <w:t xml:space="preserve">Data is a collection of facts, </w:t>
       </w:r>
@@ -524,6 +466,9 @@
       </w:r>
     </w:p>
     <w:p>
+      <w:pPr>
+        <w:jc w:val="both"/>
+      </w:pPr>
       <w:r>
         <w:rPr>
           <w:b/>
@@ -553,13 +498,14 @@
     <w:p>
       <w:pPr>
         <w:pStyle w:val="Heading2"/>
+        <w:jc w:val="both"/>
         <w:rPr>
           <w:b/>
           <w:bCs/>
           <w:color w:val="000000" w:themeColor="text1"/>
         </w:rPr>
       </w:pPr>
-      <w:bookmarkStart w:id="2" w:name="_Toc240568470"/>
+      <w:bookmarkStart w:id="2" w:name="_Toc241089965"/>
       <w:r>
         <w:rPr>
           <w:b/>
@@ -571,11 +517,17 @@
       <w:bookmarkEnd w:id="2"/>
     </w:p>
     <w:p>
+      <w:pPr>
+        <w:jc w:val="both"/>
+      </w:pPr>
       <w:r>
         <w:t>Data science is the process of using data to understand what is happening, discover patterns, make predictions, and support better decisions.</w:t>
       </w:r>
     </w:p>
     <w:p>
+      <w:pPr>
+        <w:jc w:val="both"/>
+      </w:pPr>
       <w:r>
         <w:t>Example: Attendance, assignment marks etc.</w:t>
       </w:r>
@@ -583,42 +535,21 @@
     <w:p>
       <w:pPr>
         <w:pStyle w:val="Heading1"/>
-        <w:numPr>
-          <w:ilvl w:val="0"/>
-          <w:numId w:val="2"/>
-        </w:numPr>
-        <w:rPr>
-          <w:rFonts w:ascii="Times New Roman" w:hAnsi="Times New Roman" w:cs="Times New Roman"/>
-          <w:b/>
-          <w:bCs/>
-          <w:sz w:val="52"/>
-          <w:szCs w:val="52"/>
-        </w:rPr>
-      </w:pPr>
-      <w:bookmarkStart w:id="3" w:name="_Toc240568471"/>
-      <w:r>
-        <w:rPr>
-          <w:rFonts w:ascii="Times New Roman" w:hAnsi="Times New Roman" w:cs="Times New Roman"/>
-          <w:b/>
-          <w:bCs/>
-          <w:sz w:val="52"/>
-          <w:szCs w:val="52"/>
-        </w:rPr>
+        <w:jc w:val="both"/>
+      </w:pPr>
+      <w:bookmarkStart w:id="3" w:name="_Toc241089966"/>
+      <w:r>
         <w:t>Data Science Workflow</w:t>
       </w:r>
       <w:r>
-        <w:rPr>
-          <w:rFonts w:ascii="Times New Roman" w:hAnsi="Times New Roman" w:cs="Times New Roman"/>
-          <w:b/>
-          <w:bCs/>
-          <w:sz w:val="52"/>
-          <w:szCs w:val="52"/>
-        </w:rPr>
         <w:t>:</w:t>
       </w:r>
       <w:bookmarkEnd w:id="3"/>
     </w:p>
     <w:p>
+      <w:pPr>
+        <w:jc w:val="both"/>
+      </w:pPr>
       <w:r>
         <w:t>The data science workflow consists of 6 steps:</w:t>
       </w:r>
@@ -630,6 +561,7 @@
           <w:ilvl w:val="0"/>
           <w:numId w:val="3"/>
         </w:numPr>
+        <w:jc w:val="both"/>
       </w:pPr>
       <w:r>
         <w:t>Define the problem</w:t>
@@ -642,6 +574,7 @@
           <w:ilvl w:val="0"/>
           <w:numId w:val="3"/>
         </w:numPr>
+        <w:jc w:val="both"/>
       </w:pPr>
       <w:r>
         <w:t>Data collection</w:t>
@@ -654,6 +587,7 @@
           <w:ilvl w:val="0"/>
           <w:numId w:val="3"/>
         </w:numPr>
+        <w:jc w:val="both"/>
       </w:pPr>
       <w:r>
         <w:t>Data store</w:t>
@@ -666,6 +600,7 @@
           <w:ilvl w:val="0"/>
           <w:numId w:val="3"/>
         </w:numPr>
+        <w:jc w:val="both"/>
       </w:pPr>
       <w:r>
         <w:t>Explora</w:t>
@@ -681,6 +616,7 @@
           <w:ilvl w:val="0"/>
           <w:numId w:val="3"/>
         </w:numPr>
+        <w:jc w:val="both"/>
       </w:pPr>
       <w:r>
         <w:t>Data analysis or model building</w:t>
@@ -693,6 +629,7 @@
           <w:ilvl w:val="0"/>
           <w:numId w:val="3"/>
         </w:numPr>
+        <w:jc w:val="both"/>
       </w:pPr>
       <w:r>
         <w:t xml:space="preserve">Report writing </w:t>
@@ -1443,18 +1380,21 @@
     <w:link w:val="Heading1Char"/>
     <w:uiPriority w:val="9"/>
     <w:qFormat/>
-    <w:rsid w:val="00717700"/>
+    <w:rsid w:val="00EF4D64"/>
     <w:pPr>
       <w:keepNext/>
       <w:keepLines/>
       <w:spacing w:before="360" w:after="80"/>
+      <w:ind w:left="360"/>
       <w:outlineLvl w:val="0"/>
     </w:pPr>
     <w:rPr>
-      <w:rFonts w:asciiTheme="majorHAnsi" w:eastAsiaTheme="majorEastAsia" w:hAnsiTheme="majorHAnsi" w:cstheme="majorBidi"/>
-      <w:color w:val="2F5496" w:themeColor="accent1" w:themeShade="BF"/>
-      <w:sz w:val="40"/>
-      <w:szCs w:val="40"/>
+      <w:rFonts w:ascii="Times New Roman" w:eastAsiaTheme="majorEastAsia" w:hAnsi="Times New Roman" w:cs="Times New Roman"/>
+      <w:b/>
+      <w:bCs/>
+      <w:color w:val="000000" w:themeColor="text1"/>
+      <w:sz w:val="32"/>
+      <w:szCs w:val="32"/>
     </w:rPr>
   </w:style>
   <w:style w:type="paragraph" w:styleId="Heading2">
@@ -1637,6 +1577,7 @@
   <w:style w:type="character" w:default="1" w:styleId="DefaultParagraphFont">
     <w:name w:val="Default Paragraph Font"/>
     <w:uiPriority w:val="1"/>
+    <w:semiHidden/>
     <w:unhideWhenUsed/>
   </w:style>
   <w:style w:type="table" w:default="1" w:styleId="TableNormal">
@@ -1665,12 +1606,14 @@
     <w:basedOn w:val="DefaultParagraphFont"/>
     <w:link w:val="Heading1"/>
     <w:uiPriority w:val="9"/>
-    <w:rsid w:val="00717700"/>
-    <w:rPr>
-      <w:rFonts w:asciiTheme="majorHAnsi" w:eastAsiaTheme="majorEastAsia" w:hAnsiTheme="majorHAnsi" w:cstheme="majorBidi"/>
-      <w:color w:val="2F5496" w:themeColor="accent1" w:themeShade="BF"/>
-      <w:sz w:val="40"/>
-      <w:szCs w:val="40"/>
+    <w:rsid w:val="00EF4D64"/>
+    <w:rPr>
+      <w:rFonts w:ascii="Times New Roman" w:eastAsiaTheme="majorEastAsia" w:hAnsi="Times New Roman" w:cs="Times New Roman"/>
+      <w:b/>
+      <w:bCs/>
+      <w:color w:val="000000" w:themeColor="text1"/>
+      <w:sz w:val="32"/>
+      <w:szCs w:val="32"/>
     </w:rPr>
   </w:style>
   <w:style w:type="character" w:customStyle="1" w:styleId="Heading2Char">
@@ -1974,8 +1917,6 @@
     </w:pPr>
     <w:rPr>
       <w:kern w:val="0"/>
-      <w:sz w:val="32"/>
-      <w:szCs w:val="32"/>
       <w14:ligatures w14:val="none"/>
     </w:rPr>
   </w:style>
@@ -1986,7 +1927,7 @@
     <w:autoRedefine/>
     <w:uiPriority w:val="39"/>
     <w:unhideWhenUsed/>
-    <w:rsid w:val="00270321"/>
+    <w:rsid w:val="00D35FB4"/>
     <w:pPr>
       <w:spacing w:after="100"/>
     </w:pPr>

</xml_diff>